<commit_message>
Just a lil smth about myself, Yusuf
</commit_message>
<xml_diff>
--- a/YUSUF'S_RESUME.docx
+++ b/YUSUF'S_RESUME.docx
@@ -58,43 +58,55 @@
           <w:lang w:val="en-US"/>
         </w:rPr>
       </w:pPr>
+      <w:r>
+        <w:rPr>
+          <w:rStyle w:val="Hyperlink"/>
+          <w:b/>
+          <w:lang w:val="en-US"/>
+        </w:rPr>
+        <w:fldChar w:fldCharType="begin"/>
+      </w:r>
+      <w:r>
+        <w:rPr>
+          <w:rStyle w:val="Hyperlink"/>
+          <w:b/>
+          <w:lang w:val="en-US"/>
+        </w:rPr>
+        <w:instrText xml:space="preserve"> HYPERLINK "mailto:ysanni560@gmail.com?subject=Hello%20Sanni%20Yusuf" </w:instrText>
+      </w:r>
+      <w:r>
+        <w:rPr>
+          <w:rStyle w:val="Hyperlink"/>
+          <w:b/>
+          <w:lang w:val="en-US"/>
+        </w:rPr>
+        <w:fldChar w:fldCharType="separate"/>
+      </w:r>
+      <w:r>
+        <w:rPr>
+          <w:rStyle w:val="Hyperlink"/>
+          <w:b/>
+          <w:lang w:val="en-US"/>
+        </w:rPr>
+        <w:t xml:space="preserve">ysanni560@gmail.com </w:t>
+      </w:r>
+      <w:r>
+        <w:rPr>
+          <w:rStyle w:val="Hyperlink"/>
+          <w:b/>
+          <w:lang w:val="en-US"/>
+        </w:rPr>
+        <w:fldChar w:fldCharType="end"/>
+      </w:r>
+      <w:r>
+        <w:rPr>
+          <w:b/>
+          <w:color w:val="404040" w:themeColor="text1" w:themeTint="BF"/>
+          <w:lang w:val="en-US"/>
+        </w:rPr>
+        <w:t xml:space="preserve"> |  +234-703-063-2208  | </w:t>
+      </w:r>
       <w:hyperlink r:id="rId5" w:history="1">
-        <w:r>
-          <w:rPr>
-            <w:rStyle w:val="Hyperlink"/>
-            <w:b/>
-            <w:lang w:val="en-US"/>
-          </w:rPr>
-          <w:t xml:space="preserve">ysanni560@gmail.com </w:t>
-        </w:r>
-      </w:hyperlink>
-      <w:r>
-        <w:rPr>
-          <w:b/>
-          <w:color w:val="404040" w:themeColor="text1" w:themeTint="BF"/>
-          <w:lang w:val="en-US"/>
-        </w:rPr>
-        <w:t xml:space="preserve"> </w:t>
-      </w:r>
-      <w:proofErr w:type="gramStart"/>
-      <w:r>
-        <w:rPr>
-          <w:b/>
-          <w:color w:val="404040" w:themeColor="text1" w:themeTint="BF"/>
-          <w:lang w:val="en-US"/>
-        </w:rPr>
-        <w:t>|  +</w:t>
-      </w:r>
-      <w:proofErr w:type="gramEnd"/>
-      <w:r>
-        <w:rPr>
-          <w:b/>
-          <w:color w:val="404040" w:themeColor="text1" w:themeTint="BF"/>
-          <w:lang w:val="en-US"/>
-        </w:rPr>
-        <w:t xml:space="preserve">234-703-063-2208  | </w:t>
-      </w:r>
-      <w:hyperlink r:id="rId6" w:history="1">
         <w:r>
           <w:rPr>
             <w:rStyle w:val="Hyperlink"/>
@@ -112,32 +124,73 @@
         </w:rPr>
         <w:t xml:space="preserve"> | </w:t>
       </w:r>
-      <w:hyperlink r:id="rId7" w:history="1">
+      <w:hyperlink r:id="rId6" w:history="1">
         <w:r>
           <w:rPr>
             <w:rStyle w:val="Hyperlink"/>
             <w:b/>
             <w:lang w:val="en-US"/>
           </w:rPr>
-          <w:t>x.com</w:t>
-        </w:r>
-        <w:r>
-          <w:rPr>
-            <w:rStyle w:val="Hyperlink"/>
-            <w:b/>
-            <w:lang w:val="en-US"/>
-          </w:rPr>
-          <w:t>/</w:t>
-        </w:r>
-        <w:r>
-          <w:rPr>
-            <w:rStyle w:val="Hyperlink"/>
-            <w:b/>
-            <w:lang w:val="en-US"/>
-          </w:rPr>
-          <w:t>s4nni_yusuf</w:t>
+          <w:t>x.com/s4nni_yusuf</w:t>
         </w:r>
       </w:hyperlink>
+      <w:r>
+        <w:rPr>
+          <w:rStyle w:val="Hyperlink"/>
+          <w:b/>
+          <w:lang w:val="en-US"/>
+        </w:rPr>
+        <w:t xml:space="preserve"> | </w:t>
+      </w:r>
+      <w:r>
+        <w:rPr>
+          <w:rStyle w:val="Hyperlink"/>
+          <w:b/>
+          <w:lang w:val="en-US"/>
+        </w:rPr>
+        <w:fldChar w:fldCharType="begin"/>
+      </w:r>
+      <w:r>
+        <w:rPr>
+          <w:rStyle w:val="Hyperlink"/>
+          <w:b/>
+          <w:lang w:val="en-US"/>
+        </w:rPr>
+        <w:instrText>HYPERLINK "https://www.linkedin.com/in/yusuf-sanni-b25228343"</w:instrText>
+      </w:r>
+      <w:r>
+        <w:rPr>
+          <w:rStyle w:val="Hyperlink"/>
+          <w:b/>
+          <w:lang w:val="en-US"/>
+        </w:rPr>
+      </w:r>
+      <w:r>
+        <w:rPr>
+          <w:rStyle w:val="Hyperlink"/>
+          <w:b/>
+          <w:lang w:val="en-US"/>
+        </w:rPr>
+        <w:fldChar w:fldCharType="separate"/>
+      </w:r>
+      <w:r>
+        <w:rPr>
+          <w:rStyle w:val="Hyperlink"/>
+          <w:b/>
+          <w:lang w:val="en-US"/>
+        </w:rPr>
+        <w:t>https://www.linkedin.com/in/yusuf-sanni-b25228343</w:t>
+      </w:r>
+      <w:r>
+        <w:rPr>
+          <w:rStyle w:val="Hyperlink"/>
+          <w:b/>
+          <w:lang w:val="en-US"/>
+        </w:rPr>
+        <w:fldChar w:fldCharType="end"/>
+      </w:r>
+      <w:bookmarkStart w:id="0" w:name="_GoBack"/>
+      <w:bookmarkEnd w:id="0"/>
     </w:p>
     <w:p>
       <w:pPr>
@@ -950,13 +1003,6 @@
           <w:color w:val="404040" w:themeColor="text1" w:themeTint="BF"/>
           <w:lang w:val="en-US"/>
         </w:rPr>
-      </w:r>
-      <w:r>
-        <w:rPr>
-          <w:b/>
-          <w:color w:val="404040" w:themeColor="text1" w:themeTint="BF"/>
-          <w:lang w:val="en-US"/>
-        </w:rPr>
         <w:fldChar w:fldCharType="separate"/>
       </w:r>
       <w:r>
@@ -965,41 +1011,7 @@
           <w:b/>
           <w:lang w:val="en-US"/>
         </w:rPr>
-        <w:t>https://github.com/s4nniy</w:t>
-      </w:r>
-      <w:r>
-        <w:rPr>
-          <w:rStyle w:val="Hyperlink"/>
-          <w:b/>
-          <w:lang w:val="en-US"/>
-        </w:rPr>
-        <w:t>u</w:t>
-      </w:r>
-      <w:r>
-        <w:rPr>
-          <w:rStyle w:val="Hyperlink"/>
-          <w:b/>
-          <w:lang w:val="en-US"/>
-        </w:rPr>
-        <w:t>suf/C</w:t>
-      </w:r>
-      <w:bookmarkStart w:id="0" w:name="_GoBack"/>
-      <w:bookmarkEnd w:id="0"/>
-      <w:r>
-        <w:rPr>
-          <w:rStyle w:val="Hyperlink"/>
-          <w:b/>
-          <w:lang w:val="en-US"/>
-        </w:rPr>
-        <w:t>l</w:t>
-      </w:r>
-      <w:r>
-        <w:rPr>
-          <w:rStyle w:val="Hyperlink"/>
-          <w:b/>
-          <w:lang w:val="en-US"/>
-        </w:rPr>
-        <w:t>aimCheck</w:t>
+        <w:t>https://github.com/s4nniyusuf/ClaimCheck</w:t>
       </w:r>
       <w:r>
         <w:rPr>
@@ -1257,13 +1269,6 @@
           <w:color w:val="262626" w:themeColor="text1" w:themeTint="D9"/>
           <w:lang w:val="en-US"/>
         </w:rPr>
-      </w:r>
-      <w:r>
-        <w:rPr>
-          <w:b/>
-          <w:color w:val="262626" w:themeColor="text1" w:themeTint="D9"/>
-          <w:lang w:val="en-US"/>
-        </w:rPr>
         <w:fldChar w:fldCharType="separate"/>
       </w:r>
       <w:r>
@@ -1272,23 +1277,7 @@
           <w:b/>
           <w:lang w:val="en-US"/>
         </w:rPr>
-        <w:t>https://github.com/s4nniyusuf/9jaBall</w:t>
-      </w:r>
-      <w:r>
-        <w:rPr>
-          <w:rStyle w:val="Hyperlink"/>
-          <w:b/>
-          <w:lang w:val="en-US"/>
-        </w:rPr>
-        <w:t>G</w:t>
-      </w:r>
-      <w:r>
-        <w:rPr>
-          <w:rStyle w:val="Hyperlink"/>
-          <w:b/>
-          <w:lang w:val="en-US"/>
-        </w:rPr>
-        <w:t>ist</w:t>
+        <w:t>https://github.com/s4nniyusuf/9jaBallGist</w:t>
       </w:r>
       <w:r>
         <w:rPr>
@@ -1606,30 +1595,14 @@
         <w:t>[</w:t>
       </w:r>
       <w:proofErr w:type="gramEnd"/>
-      <w:hyperlink r:id="rId8" w:history="1">
+      <w:hyperlink r:id="rId7" w:history="1">
         <w:r>
           <w:rPr>
             <w:rStyle w:val="Hyperlink"/>
             <w:b/>
             <w:lang w:val="en-US"/>
           </w:rPr>
-          <w:t>https://github.com/s4n</w:t>
-        </w:r>
-        <w:r>
-          <w:rPr>
-            <w:rStyle w:val="Hyperlink"/>
-            <w:b/>
-            <w:lang w:val="en-US"/>
-          </w:rPr>
-          <w:t>n</w:t>
-        </w:r>
-        <w:r>
-          <w:rPr>
-            <w:rStyle w:val="Hyperlink"/>
-            <w:b/>
-            <w:lang w:val="en-US"/>
-          </w:rPr>
-          <w:t>iyusuf/Personality-Type-Detector</w:t>
+          <w:t>https://github.com/s4nniyusuf/Personality-Type-Detector</w:t>
         </w:r>
       </w:hyperlink>
       <w:r>

</xml_diff>